<commit_message>
docs(ficha): la ficha no decia donde vive el repositorio
Se agrega el repositorio como hipervinculo en la linea de cabecera, junto al
Org Id y la version de API, que es donde ya viven los datos de procedencia del
documento. Sigue en 3 paginas exactas.

Co-Authored-By: Claude Opus 5 <noreply@anthropic.com>
</commit_message>
<xml_diff>
--- a/torre-agentforce/entrega/Ficha_Tecnica_Equipo35_Agente_Postventa_Zapata.docx
+++ b/torre-agentforce/entrega/Ficha_Tecnica_Equipo35_Agente_Postventa_Zapata.docx
@@ -64,6 +64,27 @@
         </w:rPr>
         <w:t xml:space="preserve">Diego González Garduño — Arquitecto de agente  ·  Gabriel Valadez Gómez — Desarrollador de plataforma  ·  Mtra. Guadalupe Becerra Doncel — Mentora     |     Org 00DgK00000VXSyCUAX · API 67.0 · 12 de agosto de 2026</w:t>
       </w:r>
+      <w:r>
+        <w:rPr>
+          <w:rFonts w:ascii="Calibri" w:cs="Calibri" w:eastAsia="Calibri" w:hAnsi="Calibri"/>
+          <w:sz w:val="17"/>
+          <w:szCs w:val="17"/>
+          <w:color w:val="5A554C"/>
+        </w:rPr>
+        <w:t xml:space="preserve"> · Repositorio: </w:t>
+      </w:r>
+      <w:hyperlink r:id="rId100">
+        <w:r>
+          <w:rPr>
+            <w:rFonts w:ascii="Calibri" w:cs="Calibri" w:eastAsia="Calibri" w:hAnsi="Calibri"/>
+            <w:sz w:val="17"/>
+            <w:szCs w:val="17"/>
+            <w:color w:val="A0690A"/>
+            <w:u w:val="single"/>
+          </w:rPr>
+          <w:t xml:space="preserve">github.com/MarkedSplash31/reto-agentforce-zapata</w:t>
+        </w:r>
+      </w:hyperlink>
     </w:p>
     <w:p>
       <w:pPr>

</xml_diff>